<commit_message>
cập nhập tài liệu hệ thống
</commit_message>
<xml_diff>
--- a/vmware/Reset root password Horizon UAG.docx
+++ b/vmware/Reset root password Horizon UAG.docx
@@ -17,6 +17,9 @@
     </w:p>
     <w:p>
       <w:r>
+        <w:rPr>
+          <w:noProof/>
+        </w:rPr>
         <w:drawing>
           <wp:inline distT="0" distB="0" distL="0" distR="0" wp14:anchorId="476555C7" wp14:editId="4F0E48E8">
             <wp:extent cx="5579745" cy="2858135"/>
@@ -84,6 +87,9 @@
     </w:p>
     <w:p>
       <w:r>
+        <w:rPr>
+          <w:noProof/>
+        </w:rPr>
         <w:drawing>
           <wp:inline distT="0" distB="0" distL="0" distR="0" wp14:anchorId="1F60E920" wp14:editId="77FC9FA2">
             <wp:extent cx="5579745" cy="3233420"/>
@@ -139,6 +145,27 @@
         <w:t xml:space="preserve"> /boot/$photon_linux root=$rootpartition rw init=/bin/bash</w:t>
       </w:r>
     </w:p>
+    <w:p/>
+    <w:p/>
+    <w:p>
+      <w:r>
+        <w:t xml:space="preserve">Bước 5: Reset password admin </w:t>
+      </w:r>
+      <w:r>
+        <w:t xml:space="preserve">chạy lệnh </w:t>
+      </w:r>
+      <w:r>
+        <w:t>adminpwd</w:t>
+      </w:r>
+    </w:p>
+    <w:p>
+      <w:r>
+        <w:t>Uag-02 BVQY : admin/Idc@2026!123</w:t>
+      </w:r>
+    </w:p>
+    <w:p/>
+    <w:p/>
+    <w:p/>
     <w:p/>
     <w:p/>
     <w:p/>
@@ -756,6 +783,7 @@
   <w:style w:type="character" w:default="1" w:styleId="Phngmcinhcuaoanvn">
     <w:name w:val="Default Paragraph Font"/>
     <w:uiPriority w:val="1"/>
+    <w:semiHidden/>
     <w:unhideWhenUsed/>
   </w:style>
   <w:style w:type="table" w:default="1" w:styleId="BangThngthng">

</xml_diff>